<commit_message>
Clean up tooling references in docs
</commit_message>
<xml_diff>
--- a/docs/BackendTestPlan.docx
+++ b/docs/BackendTestPlan.docx
@@ -486,7 +486,7 @@
           </w:tcPr>
           <w:p>
             <w:r>
-              <w:t>GET /api/amenities returns the linked nav_node lat/lng (not the raw amenity row) — regression guard for the coordinate-frame-mixing bug class flagged in CLAUDE.md (test_endpoints.py::TestViewAmenities::test_get_amenities_returns_list)</w:t>
+              <w:t>GET /api/amenities returns the linked nav_node lat/lng (not the raw amenity row) — regression guard for the coordinate-frame-mixing bug class flagged in the project notes (test_endpoints.py::TestViewAmenities::test_get_amenities_returns_list)</w:t>
             </w:r>
           </w:p>
         </w:tc>
@@ -1344,7 +1344,7 @@
         <w:pStyle w:val="ListBullet"/>
       </w:pPr>
       <w:r>
-        <w:t>CLAUDE.md — project overview and architectural constraints</w:t>
+        <w:t>Project notes: project overview and architectural constraints</w:t>
       </w:r>
     </w:p>
     <w:p>

</xml_diff>